<commit_message>
Finalize Z24281098 course submission
</commit_message>
<xml_diff>
--- a/deliverables/北京交通大学计算机与信息技术学院实习实训日志-杨大松-24281118.docx
+++ b/deliverables/北京交通大学计算机与信息技术学院实习实训日志-杨大松-24281118.docx
@@ -381,17 +381,7 @@
             <w:vAlign w:val="center"/>
           </w:tcPr>
           <w:p>
-            <w:pPr>
-              <w:spacing w:after="0"/>
-            </w:pPr>
-            <w:r/>
             <w:r>
-              <w:rPr>
-                <w:rFonts w:ascii="Microsoft YaHei" w:hAnsi="Microsoft YaHei" w:eastAsia="Microsoft YaHei"/>
-                <w:b w:val="0"/>
-                <w:color w:val="202124"/>
-                <w:sz w:val="18"/>
-              </w:rPr>
               <w:t>2026-07-14</w:t>
             </w:r>
           </w:p>
@@ -402,18 +392,8 @@
             <w:vAlign w:val="center"/>
           </w:tcPr>
           <w:p>
-            <w:pPr>
-              <w:spacing w:after="0"/>
-            </w:pPr>
-            <w:r/>
             <w:r>
-              <w:rPr>
-                <w:rFonts w:ascii="Microsoft YaHei" w:hAnsi="Microsoft YaHei" w:eastAsia="Microsoft YaHei"/>
-                <w:b w:val="0"/>
-                <w:color w:val="202124"/>
-                <w:sz w:val="18"/>
-              </w:rPr>
-              <w:t>配合训练模块确定推理调用方式，准备后端模型加载接口。</w:t>
+              <w:t>配合确定 YOLOv8 推理接口，准备后端模型加载与结果字段。</w:t>
             </w:r>
           </w:p>
         </w:tc>
@@ -423,17 +403,7 @@
             <w:vAlign w:val="center"/>
           </w:tcPr>
           <w:p>
-            <w:pPr>
-              <w:spacing w:after="0"/>
-            </w:pPr>
-            <w:r/>
             <w:r>
-              <w:rPr>
-                <w:rFonts w:ascii="Microsoft YaHei" w:hAnsi="Microsoft YaHei" w:eastAsia="Microsoft YaHei"/>
-                <w:b w:val="0"/>
-                <w:color w:val="202124"/>
-                <w:sz w:val="18"/>
-              </w:rPr>
               <w:t>已完成</w:t>
             </w:r>
           </w:p>
@@ -446,17 +416,7 @@
             <w:vAlign w:val="center"/>
           </w:tcPr>
           <w:p>
-            <w:pPr>
-              <w:spacing w:after="0"/>
-            </w:pPr>
-            <w:r/>
             <w:r>
-              <w:rPr>
-                <w:rFonts w:ascii="Microsoft YaHei" w:hAnsi="Microsoft YaHei" w:eastAsia="Microsoft YaHei"/>
-                <w:b w:val="0"/>
-                <w:color w:val="202124"/>
-                <w:sz w:val="18"/>
-              </w:rPr>
               <w:t>2026-07-15</w:t>
             </w:r>
           </w:p>
@@ -467,18 +427,8 @@
             <w:vAlign w:val="center"/>
           </w:tcPr>
           <w:p>
-            <w:pPr>
-              <w:spacing w:after="0"/>
-            </w:pPr>
-            <w:r/>
             <w:r>
-              <w:rPr>
-                <w:rFonts w:ascii="Microsoft YaHei" w:hAnsi="Microsoft YaHei" w:eastAsia="Microsoft YaHei"/>
-                <w:b w:val="0"/>
-                <w:color w:val="202124"/>
-                <w:sz w:val="18"/>
-              </w:rPr>
-              <w:t>接入模型权重，完成单张图片推理和 JSON 返回测试。</w:t>
+              <w:t>接入最新车牌模型，完成单图推理和 JSON 返回测试。</w:t>
             </w:r>
           </w:p>
         </w:tc>
@@ -488,17 +438,7 @@
             <w:vAlign w:val="center"/>
           </w:tcPr>
           <w:p>
-            <w:pPr>
-              <w:spacing w:after="0"/>
-            </w:pPr>
-            <w:r/>
             <w:r>
-              <w:rPr>
-                <w:rFonts w:ascii="Microsoft YaHei" w:hAnsi="Microsoft YaHei" w:eastAsia="Microsoft YaHei"/>
-                <w:b w:val="0"/>
-                <w:color w:val="202124"/>
-                <w:sz w:val="18"/>
-              </w:rPr>
               <w:t>已完成</w:t>
             </w:r>
           </w:p>
@@ -511,17 +451,7 @@
             <w:vAlign w:val="center"/>
           </w:tcPr>
           <w:p>
-            <w:pPr>
-              <w:spacing w:after="0"/>
-            </w:pPr>
-            <w:r/>
             <w:r>
-              <w:rPr>
-                <w:rFonts w:ascii="Microsoft YaHei" w:hAnsi="Microsoft YaHei" w:eastAsia="Microsoft YaHei"/>
-                <w:b w:val="0"/>
-                <w:color w:val="202124"/>
-                <w:sz w:val="18"/>
-              </w:rPr>
               <w:t>2026-07-16</w:t>
             </w:r>
           </w:p>
@@ -532,18 +462,8 @@
             <w:vAlign w:val="center"/>
           </w:tcPr>
           <w:p>
-            <w:pPr>
-              <w:spacing w:after="0"/>
-            </w:pPr>
-            <w:r/>
             <w:r>
-              <w:rPr>
-                <w:rFonts w:ascii="Microsoft YaHei" w:hAnsi="Microsoft YaHei" w:eastAsia="Microsoft YaHei"/>
-                <w:b w:val="0"/>
-                <w:color w:val="202124"/>
-                <w:sz w:val="18"/>
-              </w:rPr>
-              <w:t>完成 Flask /detect 接口和前后端字段联调。</w:t>
+              <w:t>完成 /detect 与车辆档案、通行记录等 JSON 接口联调。</w:t>
             </w:r>
           </w:p>
         </w:tc>
@@ -553,17 +473,7 @@
             <w:vAlign w:val="center"/>
           </w:tcPr>
           <w:p>
-            <w:pPr>
-              <w:spacing w:after="0"/>
-            </w:pPr>
-            <w:r/>
             <w:r>
-              <w:rPr>
-                <w:rFonts w:ascii="Microsoft YaHei" w:hAnsi="Microsoft YaHei" w:eastAsia="Microsoft YaHei"/>
-                <w:b w:val="0"/>
-                <w:color w:val="202124"/>
-                <w:sz w:val="18"/>
-              </w:rPr>
               <w:t>已完成</w:t>
             </w:r>
           </w:p>
@@ -641,17 +551,7 @@
             <w:vAlign w:val="center"/>
           </w:tcPr>
           <w:p>
-            <w:pPr>
-              <w:spacing w:after="0"/>
-            </w:pPr>
-            <w:r/>
             <w:r>
-              <w:rPr>
-                <w:rFonts w:ascii="Microsoft YaHei" w:hAnsi="Microsoft YaHei" w:eastAsia="Microsoft YaHei"/>
-                <w:b w:val="0"/>
-                <w:color w:val="202124"/>
-                <w:sz w:val="18"/>
-              </w:rPr>
               <w:t>2026-07-18</w:t>
             </w:r>
           </w:p>
@@ -662,18 +562,8 @@
             <w:vAlign w:val="center"/>
           </w:tcPr>
           <w:p>
-            <w:pPr>
-              <w:spacing w:after="0"/>
-            </w:pPr>
-            <w:r/>
             <w:r>
-              <w:rPr>
-                <w:rFonts w:ascii="Microsoft YaHei" w:hAnsi="Microsoft YaHei" w:eastAsia="Microsoft YaHei"/>
-                <w:b w:val="0"/>
-                <w:color w:val="202124"/>
-                <w:sz w:val="18"/>
-              </w:rPr>
-              <w:t>升级为企业车辆管理界面，加入车辆档案和自动找车功能。</w:t>
+              <w:t>接入 RapidOCR、低可信复核、黑白名单和系统设置模块。</w:t>
             </w:r>
           </w:p>
         </w:tc>
@@ -683,17 +573,7 @@
             <w:vAlign w:val="center"/>
           </w:tcPr>
           <w:p>
-            <w:pPr>
-              <w:spacing w:after="0"/>
-            </w:pPr>
-            <w:r/>
             <w:r>
-              <w:rPr>
-                <w:rFonts w:ascii="Microsoft YaHei" w:hAnsi="Microsoft YaHei" w:eastAsia="Microsoft YaHei"/>
-                <w:b w:val="0"/>
-                <w:color w:val="202124"/>
-                <w:sz w:val="18"/>
-              </w:rPr>
               <w:t>已完成</w:t>
             </w:r>
           </w:p>
@@ -706,17 +586,7 @@
             <w:vAlign w:val="center"/>
           </w:tcPr>
           <w:p>
-            <w:pPr>
-              <w:spacing w:after="0"/>
-            </w:pPr>
-            <w:r/>
             <w:r>
-              <w:rPr>
-                <w:rFonts w:ascii="Microsoft YaHei" w:hAnsi="Microsoft YaHei" w:eastAsia="Microsoft YaHei"/>
-                <w:b w:val="0"/>
-                <w:color w:val="202124"/>
-                <w:sz w:val="18"/>
-              </w:rPr>
               <w:t>2026-07-19</w:t>
             </w:r>
           </w:p>
@@ -727,18 +597,8 @@
             <w:vAlign w:val="center"/>
           </w:tcPr>
           <w:p>
-            <w:pPr>
-              <w:spacing w:after="0"/>
-            </w:pPr>
-            <w:r/>
             <w:r>
-              <w:rPr>
-                <w:rFonts w:ascii="Microsoft YaHei" w:hAnsi="Microsoft YaHei" w:eastAsia="Microsoft YaHei"/>
-                <w:b w:val="0"/>
-                <w:color w:val="202124"/>
-                <w:sz w:val="18"/>
-              </w:rPr>
-              <w:t>运行多组样例并整理截图，完善静态演示版和演示材料。</w:t>
+              <w:t>运行国内蓝牌样例，整理功能演示和答辩讲解素材。</w:t>
             </w:r>
           </w:p>
         </w:tc>
@@ -748,17 +608,7 @@
             <w:vAlign w:val="center"/>
           </w:tcPr>
           <w:p>
-            <w:pPr>
-              <w:spacing w:after="0"/>
-            </w:pPr>
-            <w:r/>
             <w:r>
-              <w:rPr>
-                <w:rFonts w:ascii="Microsoft YaHei" w:hAnsi="Microsoft YaHei" w:eastAsia="Microsoft YaHei"/>
-                <w:b w:val="0"/>
-                <w:color w:val="202124"/>
-                <w:sz w:val="18"/>
-              </w:rPr>
               <w:t>已完成</w:t>
             </w:r>
           </w:p>
@@ -770,13 +620,7 @@
         <w:spacing w:before="240" w:line="300" w:lineRule="auto"/>
       </w:pPr>
       <w:r>
-        <w:rPr>
-          <w:rFonts w:ascii="Microsoft YaHei" w:hAnsi="Microsoft YaHei" w:eastAsia="Microsoft YaHei"/>
-          <w:b w:val="0"/>
-          <w:color w:val="202124"/>
-          <w:sz w:val="21"/>
-        </w:rPr>
-        <w:t>个人总结：本阶段主要承担Flask 后端、管理系统前端、OCR 与车辆档案匹配、运行截图和演示材料。通过连续 10 天的开发和协作，进一步熟悉了视觉 AI 项目从数据、模型到后端接口、前端展示和课程材料整理的完整过程。</w:t>
+        <w:t>个人总结：本阶段主要承担 Flask 后端、管理系统前端、RapidOCR 接入、车辆档案匹配、通行记录和系统联调，贡献度 30%。通过连续 10 天的开发和协作，完成了识别结果进入业务管理闭环的工程实现。</w:t>
       </w:r>
     </w:p>
     <w:sectPr>

</xml_diff>